<commit_message>
Met à jour le planning du lundi (export semaine 1)
Nouvel export iClub du lundi : 31 cours, 124 inscriptions, aucun cours
ajouté ni supprimé. Deux mouvements d'élèves :
- EL MIR Zohra quitte « Adultes débutant » (12:00, Terrain 5)
- MUTONI Marie-Grace rejoint « Cours adultes débutants » (12:30, Terrain 4)

Les fiches de Jad Lamaizi et Jérémie Saoul sont régénérées en conséquence.

Co-Authored-By: Claude Opus 5 <noreply@anthropic.com>
Claude-Session: https://claude.ai/code/session_01RsDkbcD3KwyPviDTcs72WZ
</commit_message>
<xml_diff>
--- a/Fiche_Jad_Lamaizi_2026-2027.docx
+++ b/Fiche_Jad_Lamaizi_2026-2027.docx
@@ -209,7 +209,7 @@
                 <w:sz w:val="19"/>
                 <w:szCs w:val="19"/>
               </w:rPr>
-              <w:t xml:space="preserve">1 cours   ·   1 h   ·   4 élèves</w:t>
+              <w:t xml:space="preserve">1 cours   ·   1 h   ·   3 élèves</w:t>
             </w:r>
           </w:p>
         </w:tc>
@@ -353,7 +353,16 @@
                 <w:sz w:val="19"/>
                 <w:szCs w:val="19"/>
               </w:rPr>
-              <w:t xml:space="preserve">EL MIR Zohra</w:t>
+              <w:t xml:space="preserve">GRENEZ Elisa</w:t>
+            </w:r>
+            <w:r>
+              <w:rPr>
+                <w:rFonts w:ascii="Calibri" w:cs="Calibri" w:eastAsia="Calibri" w:hAnsi="Calibri"/>
+                <w:color w:val="6E6E6E"/>
+                <w:sz w:val="16"/>
+                <w:szCs w:val="16"/>
+              </w:rPr>
+              <w:t xml:space="preserve">   2000 · 26.2</w:t>
             </w:r>
           </w:p>
         </w:tc>
@@ -394,7 +403,7 @@
                 <w:sz w:val="19"/>
                 <w:szCs w:val="19"/>
               </w:rPr>
-              <w:t xml:space="preserve">LIETZ Laura</w:t>
+              <w:t xml:space="preserve">MOLINARI Alessandra</w:t>
             </w:r>
             <w:r>
               <w:rPr>
@@ -403,7 +412,7 @@
                 <w:sz w:val="16"/>
                 <w:szCs w:val="16"/>
               </w:rPr>
-              <w:t xml:space="preserve">   1986 · 40.1</w:t>
+              <w:t xml:space="preserve">   1998 · 27.8</w:t>
             </w:r>
           </w:p>
         </w:tc>
@@ -449,7 +458,7 @@
                 <w:sz w:val="19"/>
                 <w:szCs w:val="19"/>
               </w:rPr>
-              <w:t xml:space="preserve">GRENEZ Elisa</w:t>
+              <w:t xml:space="preserve">LIETZ Laura</w:t>
             </w:r>
             <w:r>
               <w:rPr>
@@ -458,7 +467,7 @@
                 <w:sz w:val="16"/>
                 <w:szCs w:val="16"/>
               </w:rPr>
-              <w:t xml:space="preserve">   2000 · 26.2</w:t>
+              <w:t xml:space="preserve">   1986 · 40.2</w:t>
             </w:r>
           </w:p>
         </w:tc>
@@ -486,29 +495,11 @@
             <w:r>
               <w:rPr>
                 <w:rFonts w:ascii="Calibri" w:cs="Calibri" w:eastAsia="Calibri" w:hAnsi="Calibri"/>
-                <w:color w:val="AAAAAA"/>
-                <w:sz w:val="17"/>
-                <w:szCs w:val="17"/>
-              </w:rPr>
-              <w:t xml:space="preserve">04.  </w:t>
-            </w:r>
-            <w:r>
-              <w:rPr>
-                <w:rFonts w:ascii="Calibri" w:cs="Calibri" w:eastAsia="Calibri" w:hAnsi="Calibri"/>
                 <w:color w:val="2E2E2E"/>
-                <w:sz w:val="19"/>
-                <w:szCs w:val="19"/>
-              </w:rPr>
-              <w:t xml:space="preserve">MOLINARI Alessandra</w:t>
-            </w:r>
-            <w:r>
-              <w:rPr>
-                <w:rFonts w:ascii="Calibri" w:cs="Calibri" w:eastAsia="Calibri" w:hAnsi="Calibri"/>
-                <w:color w:val="6E6E6E"/>
-                <w:sz w:val="16"/>
-                <w:szCs w:val="16"/>
-              </w:rPr>
-              <w:t xml:space="preserve">   1998 · 27.8</w:t>
+                <w:sz w:val="14"/>
+                <w:szCs w:val="14"/>
+              </w:rPr>
+              <w:t xml:space="preserve"/>
             </w:r>
           </w:p>
         </w:tc>

</xml_diff>